<commit_message>
Quote format changes - notes
</commit_message>
<xml_diff>
--- a/btb_cvs_support/document/templates/quotation_format.docx
+++ b/btb_cvs_support/document/templates/quotation_format.docx
@@ -4481,6 +4481,67 @@
               <w:outlineLvl w:val="1"/>
               <w:rPr>
                 <w:rFonts w:ascii="Helvetica Neue" w:eastAsia="Times New Roman" w:hAnsi="Helvetica Neue" w:cs="Arial"/>
+                <w:color w:val="000000"/>
+                <w:kern w:val="0"/>
+                <w:sz w:val="18"/>
+                <w:szCs w:val="18"/>
+                <w14:ligatures w14:val="none"/>
+              </w:rPr>
+            </w:pPr>
+            <w:r>
+              <w:rPr>
+                <w:rFonts w:ascii="Helvetica Neue" w:eastAsia="Times New Roman" w:hAnsi="Helvetica Neue" w:cs="Arial"/>
+                <w:color w:val="000000"/>
+                <w:kern w:val="0"/>
+                <w:sz w:val="18"/>
+                <w:szCs w:val="18"/>
+                <w14:ligatures w14:val="none"/>
+              </w:rPr>
+              <w:t>[[$</w:t>
+            </w:r>
+            <w:proofErr w:type="spellStart"/>
+            <w:proofErr w:type="gramStart"/>
+            <w:r>
+              <w:rPr>
+                <w:rFonts w:ascii="Helvetica Neue" w:eastAsia="Times New Roman" w:hAnsi="Helvetica Neue" w:cs="Arial"/>
+                <w:color w:val="000000"/>
+                <w:kern w:val="0"/>
+                <w:sz w:val="18"/>
+                <w:szCs w:val="18"/>
+                <w14:ligatures w14:val="none"/>
+              </w:rPr>
+              <w:t>sNo</w:t>
+            </w:r>
+            <w:proofErr w:type="spellEnd"/>
+            <w:r>
+              <w:rPr>
+                <w:rFonts w:ascii="Helvetica Neue" w:eastAsia="Times New Roman" w:hAnsi="Helvetica Neue" w:cs="Arial"/>
+                <w:color w:val="000000"/>
+                <w:kern w:val="0"/>
+                <w:sz w:val="18"/>
+                <w:szCs w:val="18"/>
+                <w14:ligatures w14:val="none"/>
+              </w:rPr>
+              <w:t xml:space="preserve"> :</w:t>
+            </w:r>
+            <w:proofErr w:type="gramEnd"/>
+            <w:r>
+              <w:rPr>
+                <w:rFonts w:ascii="Helvetica Neue" w:eastAsia="Times New Roman" w:hAnsi="Helvetica Neue" w:cs="Arial"/>
+                <w:color w:val="000000"/>
+                <w:kern w:val="0"/>
+                <w:sz w:val="18"/>
+                <w:szCs w:val="18"/>
+                <w14:ligatures w14:val="none"/>
+              </w:rPr>
+              <w:t>= 1]]</w:t>
+            </w:r>
+          </w:p>
+          <w:p>
+            <w:pPr>
+              <w:outlineLvl w:val="1"/>
+              <w:rPr>
+                <w:rFonts w:ascii="Helvetica Neue" w:eastAsia="Times New Roman" w:hAnsi="Helvetica Neue" w:cs="Arial"/>
                 <w:b/>
                 <w:bCs/>
                 <w:color w:val="000000"/>
@@ -4513,7 +4574,7 @@
                 <w:szCs w:val="18"/>
                 <w14:ligatures w14:val="none"/>
               </w:rPr>
-              <w:t>sNo</w:t>
+              <w:t>cVal</w:t>
             </w:r>
             <w:proofErr w:type="spellEnd"/>
             <w:r>
@@ -4537,7 +4598,7 @@
                 <w:szCs w:val="18"/>
                 <w14:ligatures w14:val="none"/>
               </w:rPr>
-              <w:t>= 1]]</w:t>
+              <w:t>=0]]</w:t>
             </w:r>
           </w:p>
           <w:p>
@@ -5018,7 +5079,7 @@
                 <w:lang w:val="en-US"/>
                 <w14:ligatures w14:val="none"/>
               </w:rPr>
-              <w:t>[[if eq $</w:t>
+              <w:t>[[if $</w:t>
             </w:r>
             <w:proofErr w:type="spellStart"/>
             <w:proofErr w:type="gramStart"/>
@@ -5032,7 +5093,7 @@
                 <w:lang w:val="en-US"/>
                 <w14:ligatures w14:val="none"/>
               </w:rPr>
-              <w:t>pv.productCode</w:t>
+              <w:t>s.notes</w:t>
             </w:r>
             <w:proofErr w:type="spellEnd"/>
             <w:proofErr w:type="gramEnd"/>
@@ -5046,7 +5107,7 @@
                 <w:lang w:val="en-US"/>
                 <w14:ligatures w14:val="none"/>
               </w:rPr>
-              <w:t xml:space="preserve"> “ULRD”]]</w:t>
+              <w:t>]]</w:t>
             </w:r>
           </w:p>
           <w:p>
@@ -5072,72 +5133,22 @@
                 <w:lang w:val="en-US"/>
                 <w14:ligatures w14:val="none"/>
               </w:rPr>
-              <w:t>[[</w:t>
-            </w:r>
-            <w:r>
-              <w:rPr>
-                <w:rFonts w:ascii="Helvetica Neue" w:eastAsia="Times New Roman" w:hAnsi="Helvetica Neue" w:cs="Arial"/>
-                <w:color w:val="000000"/>
-                <w:kern w:val="0"/>
-                <w:sz w:val="18"/>
-                <w:szCs w:val="18"/>
-                <w:lang w:val="en-US"/>
-                <w14:ligatures w14:val="none"/>
-              </w:rPr>
-              <w:t>if eq $</w:t>
+              <w:t>[[$</w:t>
             </w:r>
             <w:proofErr w:type="spellStart"/>
-            <w:proofErr w:type="gramStart"/>
-            <w:r>
-              <w:rPr>
-                <w:rFonts w:ascii="Helvetica Neue" w:eastAsia="Times New Roman" w:hAnsi="Helvetica Neue" w:cs="Arial"/>
-                <w:color w:val="000000"/>
-                <w:kern w:val="0"/>
-                <w:sz w:val="18"/>
-                <w:szCs w:val="18"/>
-                <w:lang w:val="en-US"/>
-                <w14:ligatures w14:val="none"/>
-              </w:rPr>
-              <w:t>s.transitionType</w:t>
+            <w:r>
+              <w:rPr>
+                <w:rFonts w:ascii="Helvetica Neue" w:eastAsia="Times New Roman" w:hAnsi="Helvetica Neue" w:cs="Arial"/>
+                <w:color w:val="000000"/>
+                <w:kern w:val="0"/>
+                <w:sz w:val="18"/>
+                <w:szCs w:val="18"/>
+                <w:lang w:val="en-US"/>
+                <w14:ligatures w14:val="none"/>
+              </w:rPr>
+              <w:t>s.notes</w:t>
             </w:r>
             <w:proofErr w:type="spellEnd"/>
-            <w:proofErr w:type="gramEnd"/>
-            <w:r>
-              <w:rPr>
-                <w:rFonts w:ascii="Helvetica Neue" w:eastAsia="Times New Roman" w:hAnsi="Helvetica Neue" w:cs="Arial"/>
-                <w:color w:val="000000"/>
-                <w:kern w:val="0"/>
-                <w:sz w:val="18"/>
-                <w:szCs w:val="18"/>
-                <w:lang w:val="en-US"/>
-                <w14:ligatures w14:val="none"/>
-              </w:rPr>
-              <w:t xml:space="preserve"> “</w:t>
-            </w:r>
-            <w:r>
-              <w:rPr>
-                <w:rFonts w:ascii="Helvetica Neue" w:eastAsia="Times New Roman" w:hAnsi="Helvetica Neue" w:cs="Arial"/>
-                <w:color w:val="000000"/>
-                <w:kern w:val="0"/>
-                <w:sz w:val="18"/>
-                <w:szCs w:val="18"/>
-                <w:lang w:val="en-US"/>
-                <w14:ligatures w14:val="none"/>
-              </w:rPr>
-              <w:t>One</w:t>
-            </w:r>
-            <w:r>
-              <w:rPr>
-                <w:rFonts w:ascii="Helvetica Neue" w:eastAsia="Times New Roman" w:hAnsi="Helvetica Neue" w:cs="Arial"/>
-                <w:color w:val="000000"/>
-                <w:kern w:val="0"/>
-                <w:sz w:val="18"/>
-                <w:szCs w:val="18"/>
-                <w:lang w:val="en-US"/>
-                <w14:ligatures w14:val="none"/>
-              </w:rPr>
-              <w:t xml:space="preserve"> Side”</w:t>
-            </w:r>
             <w:r>
               <w:rPr>
                 <w:rFonts w:ascii="Helvetica Neue" w:eastAsia="Times New Roman" w:hAnsi="Helvetica Neue" w:cs="Arial"/>
@@ -5160,563 +5171,6 @@
                 <w:kern w:val="0"/>
                 <w:sz w:val="18"/>
                 <w:szCs w:val="18"/>
-                <w:lang w:val="en-US"/>
-                <w14:ligatures w14:val="none"/>
-              </w:rPr>
-            </w:pPr>
-            <w:r>
-              <w:rPr>
-                <w:rFonts w:ascii="Helvetica Neue" w:eastAsia="Times New Roman" w:hAnsi="Helvetica Neue" w:cs="Arial"/>
-                <w:color w:val="000000"/>
-                <w:kern w:val="0"/>
-                <w:sz w:val="18"/>
-                <w:szCs w:val="18"/>
-                <w:lang w:val="en-US"/>
-                <w14:ligatures w14:val="none"/>
-              </w:rPr>
-              <w:t>Transition 1: D[[$</w:t>
-            </w:r>
-            <w:proofErr w:type="spellStart"/>
-            <w:proofErr w:type="gramStart"/>
-            <w:r>
-              <w:rPr>
-                <w:rFonts w:ascii="Helvetica Neue" w:eastAsia="Times New Roman" w:hAnsi="Helvetica Neue" w:cs="Arial"/>
-                <w:color w:val="000000"/>
-                <w:kern w:val="0"/>
-                <w:sz w:val="18"/>
-                <w:szCs w:val="18"/>
-                <w:lang w:val="en-US"/>
-                <w14:ligatures w14:val="none"/>
-              </w:rPr>
-              <w:t>s.transitionDiameter</w:t>
-            </w:r>
-            <w:proofErr w:type="spellEnd"/>
-            <w:proofErr w:type="gramEnd"/>
-            <w:r>
-              <w:rPr>
-                <w:rFonts w:ascii="Helvetica Neue" w:eastAsia="Times New Roman" w:hAnsi="Helvetica Neue" w:cs="Arial"/>
-                <w:color w:val="000000"/>
-                <w:kern w:val="0"/>
-                <w:sz w:val="18"/>
-                <w:szCs w:val="18"/>
-                <w:lang w:val="en-US"/>
-                <w14:ligatures w14:val="none"/>
-              </w:rPr>
-              <w:t>]] x L[[$</w:t>
-            </w:r>
-            <w:proofErr w:type="spellStart"/>
-            <w:proofErr w:type="gramStart"/>
-            <w:r>
-              <w:rPr>
-                <w:rFonts w:ascii="Helvetica Neue" w:eastAsia="Times New Roman" w:hAnsi="Helvetica Neue" w:cs="Arial"/>
-                <w:color w:val="000000"/>
-                <w:kern w:val="0"/>
-                <w:sz w:val="18"/>
-                <w:szCs w:val="18"/>
-                <w:lang w:val="en-US"/>
-                <w14:ligatures w14:val="none"/>
-              </w:rPr>
-              <w:t>s.transitionLength</w:t>
-            </w:r>
-            <w:proofErr w:type="spellEnd"/>
-            <w:proofErr w:type="gramEnd"/>
-            <w:r>
-              <w:rPr>
-                <w:rFonts w:ascii="Helvetica Neue" w:eastAsia="Times New Roman" w:hAnsi="Helvetica Neue" w:cs="Arial"/>
-                <w:color w:val="000000"/>
-                <w:kern w:val="0"/>
-                <w:sz w:val="18"/>
-                <w:szCs w:val="18"/>
-                <w:lang w:val="en-US"/>
-                <w14:ligatures w14:val="none"/>
-              </w:rPr>
-              <w:t>]]</w:t>
-            </w:r>
-          </w:p>
-          <w:p>
-            <w:pPr>
-              <w:jc w:val="center"/>
-              <w:rPr>
-                <w:rFonts w:ascii="Helvetica Neue" w:eastAsia="Times New Roman" w:hAnsi="Helvetica Neue" w:cs="Arial"/>
-                <w:color w:val="000000"/>
-                <w:kern w:val="0"/>
-                <w:sz w:val="18"/>
-                <w:szCs w:val="18"/>
-                <w:lang w:val="en-US"/>
-                <w14:ligatures w14:val="none"/>
-              </w:rPr>
-            </w:pPr>
-            <w:r>
-              <w:rPr>
-                <w:rFonts w:ascii="Helvetica Neue" w:eastAsia="Times New Roman" w:hAnsi="Helvetica Neue" w:cs="Arial"/>
-                <w:color w:val="000000"/>
-                <w:kern w:val="0"/>
-                <w:sz w:val="18"/>
-                <w:szCs w:val="18"/>
-                <w:lang w:val="en-US"/>
-                <w14:ligatures w14:val="none"/>
-              </w:rPr>
-              <w:t>[[end]]</w:t>
-            </w:r>
-          </w:p>
-          <w:p>
-            <w:pPr>
-              <w:jc w:val="center"/>
-              <w:rPr>
-                <w:rFonts w:ascii="Helvetica Neue" w:eastAsia="Times New Roman" w:hAnsi="Helvetica Neue" w:cs="Arial"/>
-                <w:color w:val="000000"/>
-                <w:kern w:val="0"/>
-                <w:sz w:val="18"/>
-                <w:szCs w:val="18"/>
-                <w:lang w:val="en-US"/>
-                <w14:ligatures w14:val="none"/>
-              </w:rPr>
-            </w:pPr>
-            <w:r>
-              <w:rPr>
-                <w:rFonts w:ascii="Helvetica Neue" w:eastAsia="Times New Roman" w:hAnsi="Helvetica Neue" w:cs="Arial"/>
-                <w:color w:val="000000"/>
-                <w:kern w:val="0"/>
-                <w:sz w:val="18"/>
-                <w:szCs w:val="18"/>
-                <w:lang w:val="en-US"/>
-                <w14:ligatures w14:val="none"/>
-              </w:rPr>
-              <w:t>[[if eq $</w:t>
-            </w:r>
-            <w:proofErr w:type="spellStart"/>
-            <w:proofErr w:type="gramStart"/>
-            <w:r>
-              <w:rPr>
-                <w:rFonts w:ascii="Helvetica Neue" w:eastAsia="Times New Roman" w:hAnsi="Helvetica Neue" w:cs="Arial"/>
-                <w:color w:val="000000"/>
-                <w:kern w:val="0"/>
-                <w:sz w:val="18"/>
-                <w:szCs w:val="18"/>
-                <w:lang w:val="en-US"/>
-                <w14:ligatures w14:val="none"/>
-              </w:rPr>
-              <w:t>s.transitionType</w:t>
-            </w:r>
-            <w:proofErr w:type="spellEnd"/>
-            <w:proofErr w:type="gramEnd"/>
-            <w:r>
-              <w:rPr>
-                <w:rFonts w:ascii="Helvetica Neue" w:eastAsia="Times New Roman" w:hAnsi="Helvetica Neue" w:cs="Arial"/>
-                <w:color w:val="000000"/>
-                <w:kern w:val="0"/>
-                <w:sz w:val="18"/>
-                <w:szCs w:val="18"/>
-                <w:lang w:val="en-US"/>
-                <w14:ligatures w14:val="none"/>
-              </w:rPr>
-              <w:t xml:space="preserve"> “Both Sides”]]</w:t>
-            </w:r>
-          </w:p>
-          <w:p>
-            <w:pPr>
-              <w:jc w:val="center"/>
-              <w:rPr>
-                <w:rFonts w:ascii="Helvetica Neue" w:eastAsia="Times New Roman" w:hAnsi="Helvetica Neue" w:cs="Arial"/>
-                <w:color w:val="000000"/>
-                <w:kern w:val="0"/>
-                <w:sz w:val="18"/>
-                <w:szCs w:val="18"/>
-                <w:lang w:val="en-US"/>
-                <w14:ligatures w14:val="none"/>
-              </w:rPr>
-            </w:pPr>
-            <w:r>
-              <w:rPr>
-                <w:rFonts w:ascii="Helvetica Neue" w:eastAsia="Times New Roman" w:hAnsi="Helvetica Neue" w:cs="Arial"/>
-                <w:color w:val="000000"/>
-                <w:kern w:val="0"/>
-                <w:sz w:val="18"/>
-                <w:szCs w:val="18"/>
-                <w:lang w:val="en-US"/>
-                <w14:ligatures w14:val="none"/>
-              </w:rPr>
-              <w:t>, Transition 2: D[[$</w:t>
-            </w:r>
-            <w:proofErr w:type="gramStart"/>
-            <w:r>
-              <w:rPr>
-                <w:rFonts w:ascii="Helvetica Neue" w:eastAsia="Times New Roman" w:hAnsi="Helvetica Neue" w:cs="Arial"/>
-                <w:color w:val="000000"/>
-                <w:kern w:val="0"/>
-                <w:sz w:val="18"/>
-                <w:szCs w:val="18"/>
-                <w:lang w:val="en-US"/>
-                <w14:ligatures w14:val="none"/>
-              </w:rPr>
-              <w:t>s.transitionDiameter</w:t>
-            </w:r>
-            <w:proofErr w:type="gramEnd"/>
-            <w:r>
-              <w:rPr>
-                <w:rFonts w:ascii="Helvetica Neue" w:eastAsia="Times New Roman" w:hAnsi="Helvetica Neue" w:cs="Arial"/>
-                <w:color w:val="000000"/>
-                <w:kern w:val="0"/>
-                <w:sz w:val="18"/>
-                <w:szCs w:val="18"/>
-                <w:lang w:val="en-US"/>
-                <w14:ligatures w14:val="none"/>
-              </w:rPr>
-              <w:t>2]] x L[[$</w:t>
-            </w:r>
-            <w:proofErr w:type="gramStart"/>
-            <w:r>
-              <w:rPr>
-                <w:rFonts w:ascii="Helvetica Neue" w:eastAsia="Times New Roman" w:hAnsi="Helvetica Neue" w:cs="Arial"/>
-                <w:color w:val="000000"/>
-                <w:kern w:val="0"/>
-                <w:sz w:val="18"/>
-                <w:szCs w:val="18"/>
-                <w:lang w:val="en-US"/>
-                <w14:ligatures w14:val="none"/>
-              </w:rPr>
-              <w:t>s.transitionLength</w:t>
-            </w:r>
-            <w:proofErr w:type="gramEnd"/>
-            <w:r>
-              <w:rPr>
-                <w:rFonts w:ascii="Helvetica Neue" w:eastAsia="Times New Roman" w:hAnsi="Helvetica Neue" w:cs="Arial"/>
-                <w:color w:val="000000"/>
-                <w:kern w:val="0"/>
-                <w:sz w:val="18"/>
-                <w:szCs w:val="18"/>
-                <w:lang w:val="en-US"/>
-                <w14:ligatures w14:val="none"/>
-              </w:rPr>
-              <w:t>2]]</w:t>
-            </w:r>
-          </w:p>
-          <w:p>
-            <w:pPr>
-              <w:jc w:val="center"/>
-              <w:rPr>
-                <w:rFonts w:ascii="Helvetica Neue" w:eastAsia="Times New Roman" w:hAnsi="Helvetica Neue" w:cs="Arial"/>
-                <w:color w:val="000000"/>
-                <w:kern w:val="0"/>
-                <w:sz w:val="18"/>
-                <w:szCs w:val="18"/>
-                <w:lang w:val="en-US"/>
-                <w14:ligatures w14:val="none"/>
-              </w:rPr>
-            </w:pPr>
-            <w:r>
-              <w:rPr>
-                <w:rFonts w:ascii="Helvetica Neue" w:eastAsia="Times New Roman" w:hAnsi="Helvetica Neue" w:cs="Arial"/>
-                <w:color w:val="000000"/>
-                <w:kern w:val="0"/>
-                <w:sz w:val="18"/>
-                <w:szCs w:val="18"/>
-                <w:lang w:val="en-US"/>
-                <w14:ligatures w14:val="none"/>
-              </w:rPr>
-              <w:t>[[end]]</w:t>
-            </w:r>
-          </w:p>
-          <w:p>
-            <w:pPr>
-              <w:jc w:val="center"/>
-              <w:rPr>
-                <w:rFonts w:ascii="Helvetica Neue" w:eastAsia="Times New Roman" w:hAnsi="Helvetica Neue" w:cs="Arial"/>
-                <w:color w:val="000000"/>
-                <w:kern w:val="0"/>
-                <w:sz w:val="18"/>
-                <w:szCs w:val="18"/>
-                <w:lang w:val="en-US"/>
-                <w14:ligatures w14:val="none"/>
-              </w:rPr>
-            </w:pPr>
-            <w:r>
-              <w:rPr>
-                <w:rFonts w:ascii="Helvetica Neue" w:eastAsia="Times New Roman" w:hAnsi="Helvetica Neue" w:cs="Arial"/>
-                <w:color w:val="000000"/>
-                <w:kern w:val="0"/>
-                <w:sz w:val="18"/>
-                <w:szCs w:val="18"/>
-                <w:lang w:val="en-US"/>
-                <w14:ligatures w14:val="none"/>
-              </w:rPr>
-              <w:t>[[end]]</w:t>
-            </w:r>
-          </w:p>
-          <w:p>
-            <w:pPr>
-              <w:jc w:val="center"/>
-              <w:rPr>
-                <w:rFonts w:ascii="Helvetica Neue" w:eastAsia="Times New Roman" w:hAnsi="Helvetica Neue" w:cs="Arial"/>
-                <w:color w:val="000000"/>
-                <w:kern w:val="0"/>
-                <w:sz w:val="18"/>
-                <w:szCs w:val="18"/>
-                <w:lang w:val="en-US"/>
-                <w14:ligatures w14:val="none"/>
-              </w:rPr>
-            </w:pPr>
-            <w:r>
-              <w:rPr>
-                <w:rFonts w:ascii="Helvetica Neue" w:eastAsia="Times New Roman" w:hAnsi="Helvetica Neue" w:cs="Arial"/>
-                <w:color w:val="000000"/>
-                <w:kern w:val="0"/>
-                <w:sz w:val="18"/>
-                <w:szCs w:val="18"/>
-                <w:lang w:val="en-US"/>
-                <w14:ligatures w14:val="none"/>
-              </w:rPr>
-              <w:t xml:space="preserve">[[if </w:t>
-            </w:r>
-            <w:r>
-              <w:rPr>
-                <w:rFonts w:ascii="Helvetica Neue" w:eastAsia="Times New Roman" w:hAnsi="Helvetica Neue" w:cs="Arial"/>
-                <w:color w:val="000000"/>
-                <w:kern w:val="0"/>
-                <w:sz w:val="18"/>
-                <w:szCs w:val="18"/>
-                <w:lang w:val="en-US"/>
-                <w14:ligatures w14:val="none"/>
-              </w:rPr>
-              <w:t>eq</w:t>
-            </w:r>
-            <w:r>
-              <w:rPr>
-                <w:rFonts w:ascii="Helvetica Neue" w:eastAsia="Times New Roman" w:hAnsi="Helvetica Neue" w:cs="Arial"/>
-                <w:color w:val="000000"/>
-                <w:kern w:val="0"/>
-                <w:sz w:val="18"/>
-                <w:szCs w:val="18"/>
-                <w:lang w:val="en-US"/>
-                <w14:ligatures w14:val="none"/>
-              </w:rPr>
-              <w:t xml:space="preserve"> $</w:t>
-            </w:r>
-            <w:proofErr w:type="spellStart"/>
-            <w:proofErr w:type="gramStart"/>
-            <w:r>
-              <w:rPr>
-                <w:rFonts w:ascii="Helvetica Neue" w:eastAsia="Times New Roman" w:hAnsi="Helvetica Neue" w:cs="Arial"/>
-                <w:color w:val="000000"/>
-                <w:kern w:val="0"/>
-                <w:sz w:val="18"/>
-                <w:szCs w:val="18"/>
-                <w:lang w:val="en-US"/>
-                <w14:ligatures w14:val="none"/>
-              </w:rPr>
-              <w:t>pv.productCode</w:t>
-            </w:r>
-            <w:proofErr w:type="spellEnd"/>
-            <w:proofErr w:type="gramEnd"/>
-            <w:r>
-              <w:rPr>
-                <w:rFonts w:ascii="Helvetica Neue" w:eastAsia="Times New Roman" w:hAnsi="Helvetica Neue" w:cs="Arial"/>
-                <w:color w:val="000000"/>
-                <w:kern w:val="0"/>
-                <w:sz w:val="18"/>
-                <w:szCs w:val="18"/>
-                <w:lang w:val="en-US"/>
-                <w14:ligatures w14:val="none"/>
-              </w:rPr>
-              <w:t xml:space="preserve"> “VCDA”</w:t>
-            </w:r>
-            <w:proofErr w:type="gramStart"/>
-            <w:r>
-              <w:rPr>
-                <w:rFonts w:ascii="Helvetica Neue" w:eastAsia="Times New Roman" w:hAnsi="Helvetica Neue" w:cs="Arial"/>
-                <w:color w:val="000000"/>
-                <w:kern w:val="0"/>
-                <w:sz w:val="18"/>
-                <w:szCs w:val="18"/>
-                <w:lang w:val="en-US"/>
-                <w14:ligatures w14:val="none"/>
-              </w:rPr>
-              <w:t>]][</w:t>
-            </w:r>
-            <w:proofErr w:type="gramEnd"/>
-            <w:r>
-              <w:rPr>
-                <w:rFonts w:ascii="Helvetica Neue" w:eastAsia="Times New Roman" w:hAnsi="Helvetica Neue" w:cs="Arial"/>
-                <w:color w:val="000000"/>
-                <w:kern w:val="0"/>
-                <w:sz w:val="18"/>
-                <w:szCs w:val="18"/>
-                <w:lang w:val="en-US"/>
-                <w14:ligatures w14:val="none"/>
-              </w:rPr>
-              <w:t>[$</w:t>
-            </w:r>
-            <w:proofErr w:type="spellStart"/>
-            <w:proofErr w:type="gramStart"/>
-            <w:r>
-              <w:rPr>
-                <w:rFonts w:ascii="Helvetica Neue" w:eastAsia="Times New Roman" w:hAnsi="Helvetica Neue" w:cs="Arial"/>
-                <w:color w:val="000000"/>
-                <w:kern w:val="0"/>
-                <w:sz w:val="18"/>
-                <w:szCs w:val="18"/>
-                <w:lang w:val="en-US"/>
-                <w14:ligatures w14:val="none"/>
-              </w:rPr>
-              <w:t>s.transitionType</w:t>
-            </w:r>
-            <w:proofErr w:type="spellEnd"/>
-            <w:r>
-              <w:rPr>
-                <w:rFonts w:ascii="Helvetica Neue" w:eastAsia="Times New Roman" w:hAnsi="Helvetica Neue" w:cs="Arial"/>
-                <w:color w:val="000000"/>
-                <w:kern w:val="0"/>
-                <w:sz w:val="18"/>
-                <w:szCs w:val="18"/>
-                <w:lang w:val="en-US"/>
-                <w14:ligatures w14:val="none"/>
-              </w:rPr>
-              <w:t>]][</w:t>
-            </w:r>
-            <w:proofErr w:type="gramEnd"/>
-            <w:r>
-              <w:rPr>
-                <w:rFonts w:ascii="Helvetica Neue" w:eastAsia="Times New Roman" w:hAnsi="Helvetica Neue" w:cs="Arial"/>
-                <w:color w:val="000000"/>
-                <w:kern w:val="0"/>
-                <w:sz w:val="18"/>
-                <w:szCs w:val="18"/>
-                <w:lang w:val="en-US"/>
-                <w14:ligatures w14:val="none"/>
-              </w:rPr>
-              <w:t>[end]]</w:t>
-            </w:r>
-          </w:p>
-          <w:p>
-            <w:pPr>
-              <w:jc w:val="center"/>
-              <w:rPr>
-                <w:rFonts w:ascii="Helvetica Neue" w:eastAsia="Times New Roman" w:hAnsi="Helvetica Neue" w:cs="Arial"/>
-                <w:color w:val="000000"/>
-                <w:kern w:val="0"/>
-                <w:sz w:val="18"/>
-                <w:szCs w:val="18"/>
-                <w:lang w:val="en-US"/>
-                <w14:ligatures w14:val="none"/>
-              </w:rPr>
-            </w:pPr>
-            <w:r>
-              <w:rPr>
-                <w:rFonts w:ascii="Helvetica Neue" w:eastAsia="Times New Roman" w:hAnsi="Helvetica Neue" w:cs="Arial"/>
-                <w:color w:val="000000"/>
-                <w:kern w:val="0"/>
-                <w:sz w:val="18"/>
-                <w:szCs w:val="18"/>
-                <w:lang w:val="en-US"/>
-                <w14:ligatures w14:val="none"/>
-              </w:rPr>
-              <w:t xml:space="preserve">[[if </w:t>
-            </w:r>
-            <w:r>
-              <w:rPr>
-                <w:rFonts w:ascii="Helvetica Neue" w:eastAsia="Times New Roman" w:hAnsi="Helvetica Neue" w:cs="Arial"/>
-                <w:color w:val="000000"/>
-                <w:kern w:val="0"/>
-                <w:sz w:val="18"/>
-                <w:szCs w:val="18"/>
-                <w:lang w:val="en-US"/>
-                <w14:ligatures w14:val="none"/>
-              </w:rPr>
-              <w:t>$</w:t>
-            </w:r>
-            <w:proofErr w:type="spellStart"/>
-            <w:proofErr w:type="gramStart"/>
-            <w:r>
-              <w:rPr>
-                <w:rFonts w:ascii="Helvetica Neue" w:eastAsia="Times New Roman" w:hAnsi="Helvetica Neue" w:cs="Arial"/>
-                <w:color w:val="000000"/>
-                <w:kern w:val="0"/>
-                <w:sz w:val="18"/>
-                <w:szCs w:val="18"/>
-                <w:lang w:val="en-US"/>
-                <w14:ligatures w14:val="none"/>
-              </w:rPr>
-              <w:t>s.notes</w:t>
-            </w:r>
-            <w:proofErr w:type="spellEnd"/>
-            <w:proofErr w:type="gramEnd"/>
-            <w:r>
-              <w:rPr>
-                <w:rFonts w:ascii="Helvetica Neue" w:eastAsia="Times New Roman" w:hAnsi="Helvetica Neue" w:cs="Arial"/>
-                <w:color w:val="000000"/>
-                <w:kern w:val="0"/>
-                <w:sz w:val="18"/>
-                <w:szCs w:val="18"/>
-                <w:lang w:val="en-US"/>
-                <w14:ligatures w14:val="none"/>
-              </w:rPr>
-              <w:t>]]</w:t>
-            </w:r>
-          </w:p>
-          <w:p>
-            <w:pPr>
-              <w:jc w:val="center"/>
-              <w:rPr>
-                <w:rFonts w:ascii="Helvetica Neue" w:eastAsia="Times New Roman" w:hAnsi="Helvetica Neue" w:cs="Arial"/>
-                <w:color w:val="000000"/>
-                <w:kern w:val="0"/>
-                <w:sz w:val="18"/>
-                <w:szCs w:val="18"/>
-                <w:lang w:val="en-US"/>
-                <w14:ligatures w14:val="none"/>
-              </w:rPr>
-            </w:pPr>
-            <w:r>
-              <w:rPr>
-                <w:rFonts w:ascii="Helvetica Neue" w:eastAsia="Times New Roman" w:hAnsi="Helvetica Neue" w:cs="Arial"/>
-                <w:color w:val="000000"/>
-                <w:kern w:val="0"/>
-                <w:sz w:val="18"/>
-                <w:szCs w:val="18"/>
-                <w:lang w:val="en-US"/>
-                <w14:ligatures w14:val="none"/>
-              </w:rPr>
-              <w:t>[[$</w:t>
-            </w:r>
-            <w:proofErr w:type="spellStart"/>
-            <w:proofErr w:type="gramStart"/>
-            <w:r>
-              <w:rPr>
-                <w:rFonts w:ascii="Helvetica Neue" w:eastAsia="Times New Roman" w:hAnsi="Helvetica Neue" w:cs="Arial"/>
-                <w:color w:val="000000"/>
-                <w:kern w:val="0"/>
-                <w:sz w:val="18"/>
-                <w:szCs w:val="18"/>
-                <w:lang w:val="en-US"/>
-                <w14:ligatures w14:val="none"/>
-              </w:rPr>
-              <w:t>s.notes</w:t>
-            </w:r>
-            <w:proofErr w:type="spellEnd"/>
-            <w:proofErr w:type="gramEnd"/>
-            <w:r>
-              <w:rPr>
-                <w:rFonts w:ascii="Helvetica Neue" w:eastAsia="Times New Roman" w:hAnsi="Helvetica Neue" w:cs="Arial"/>
-                <w:color w:val="000000"/>
-                <w:kern w:val="0"/>
-                <w:sz w:val="18"/>
-                <w:szCs w:val="18"/>
-                <w:lang w:val="en-US"/>
-                <w14:ligatures w14:val="none"/>
-              </w:rPr>
-              <w:t>]]</w:t>
-            </w:r>
-          </w:p>
-          <w:p>
-            <w:pPr>
-              <w:jc w:val="center"/>
-              <w:rPr>
-                <w:rFonts w:ascii="Helvetica Neue" w:eastAsia="Times New Roman" w:hAnsi="Helvetica Neue" w:cs="Arial"/>
-                <w:color w:val="000000"/>
-                <w:kern w:val="0"/>
-                <w:sz w:val="18"/>
-                <w:szCs w:val="18"/>
-                <w:lang w:val="en-US"/>
                 <w14:ligatures w14:val="none"/>
               </w:rPr>
             </w:pPr>
@@ -6287,7 +5741,6 @@
         <w:rPr>
           <w:rFonts w:ascii="Helvetica Neue" w:hAnsi="Helvetica Neue" w:cs="Arial"/>
         </w:rPr>
-        <w:lastRenderedPageBreak/>
         <w:t xml:space="preserve">[[if </w:t>
       </w:r>
       <w:r>

</xml_diff>